<commit_message>
feat(guide): update prompt guide to SIMBOT_UNIVERSAL_PROMPT_GUIDE_V27.md
</commit_message>
<xml_diff>
--- a/EduCam/TONG_QUAN_DU_AN_WEBSHARE_PMCA.docx
+++ b/EduCam/TONG_QUAN_DU_AN_WEBSHARE_PMCA.docx
@@ -142,7 +142,7 @@
           <w:rFonts w:ascii="Times New Roman" w:hAnsi="Times New Roman"/>
           <w:sz w:val="26"/>
         </w:rPr>
-        <w:t>SimBot Universal Prompt Guide v26</w:t>
+        <w:t>SimBot Universal Prompt Guide v27</w:t>
         <w:br/>
       </w:r>
       <w:r>
@@ -3624,7 +3624,7 @@
           <w:color w:val="1E3A8A"/>
           <w:sz w:val="30"/>
         </w:rPr>
-        <w:t>CHƯƠNG 5: HỆ THỐNG CẨM NANG AI V26 VÀ HỖ TRỢ ĐA NGÔN NGỮ ĐÔNG NAM Á</w:t>
+        <w:t>CHƯƠNG 5: HỆ THỐNG CẨM NANG AI V27 VÀ HỖ TRỢ ĐA NGÔN NGỮ ĐÔNG NAM Á</w:t>
       </w:r>
     </w:p>
     <w:p>
@@ -3639,7 +3639,7 @@
           <w:color w:val="0F172A"/>
           <w:sz w:val="27"/>
         </w:rPr>
-        <w:t>5.1. Tích hợp cẩm nang SimBot Universal Prompt Guide v26</w:t>
+        <w:t>5.1. Tích hợp cẩm nang SimBot Universal Prompt Guide v27</w:t>
       </w:r>
     </w:p>
     <w:p>
@@ -3653,7 +3653,7 @@
           <w:rFonts w:ascii="Times New Roman" w:hAnsi="Times New Roman"/>
           <w:sz w:val="26"/>
         </w:rPr>
-        <w:t>Webshare-PMCA tích hợp trực tiếp bản hướng dẫn độc quyền SIMBOT_UNIVERSAL_PROMPT_GUIDE_V26.md, đóng vai trò là 'bộ não điều khiển' giúp giáo viên hợp tác cùng AI để tạo ra các mô phỏng chuẩn mực quốc tế:</w:t>
+        <w:t>Webshare-PMCA tích hợp trực tiếp bản hướng dẫn độc quyền SIMBOT_UNIVERSAL_PROMPT_GUIDE_V27.md, đóng vai trò là 'bộ não điều khiển' giúp giáo viên hợp tác cùng AI để tạo ra các mô phỏng chuẩn mực quốc tế:</w:t>
       </w:r>
     </w:p>
     <w:p>
@@ -3668,7 +3668,7 @@
           <w:color w:val="1E3A8A"/>
           <w:sz w:val="24"/>
         </w:rPr>
-        <w:t>Bảng 5.1: Quy trình 8 bước kiến tạo mô phỏng giáo dục theo chuẩn SimBot v26</w:t>
+        <w:t>Bảng 5.1: Quy trình 8 bước kiến tạo mô phỏng giáo dục theo chuẩn SimBot v27</w:t>
       </w:r>
     </w:p>
     <w:tbl>
@@ -3952,7 +3952,7 @@
                 <w:rFonts w:ascii="Times New Roman" w:hAnsi="Times New Roman"/>
                 <w:sz w:val="22"/>
               </w:rPr>
-              <w:t>Tải Prompt Guide v26</w:t>
+              <w:t>Tải Prompt Guide v27</w:t>
             </w:r>
           </w:p>
         </w:tc>
@@ -4353,7 +4353,7 @@
           <w:color w:val="0F172A"/>
           <w:sz w:val="27"/>
         </w:rPr>
-        <w:t>5.2. Chuẩn điều hướng không gian mô phỏng linh hoạt (v26 Specification)</w:t>
+        <w:t>5.2. Chuẩn điều hướng không gian mô phỏng linh hoạt (v27 Specification)</w:t>
       </w:r>
     </w:p>
     <w:p>
@@ -4367,7 +4367,7 @@
           <w:rFonts w:ascii="Times New Roman" w:hAnsi="Times New Roman"/>
           <w:sz w:val="26"/>
         </w:rPr>
-        <w:t>Điểm nâng cấp mang tính đột phá của phiên bản v26 là việc chuẩn hóa không gian làm việc mô phỏng linh hoạt (Flexible Workspace Navigation). Các sản phẩm đạt chuẩn v26 bắt buộc phải hỗ trợ các tính năng điều hướng chuyên nghiệp:</w:t>
+        <w:t>Điểm nâng cấp mang tính đột phá của phiên bản v27 là việc chuẩn hóa không gian làm việc mô phỏng linh hoạt (Flexible Workspace Navigation). Các sản phẩm đạt chuẩn v27 bắt buộc phải hỗ trợ các tính năng điều hướng chuyên nghiệp:</w:t>
       </w:r>
     </w:p>
     <w:p>
@@ -5677,7 +5677,7 @@
           <w:rFonts w:ascii="Times New Roman" w:hAnsi="Times New Roman"/>
           <w:sz w:val="26"/>
         </w:rPr>
-        <w:t>Đồng bộ hóa cẩm nang SimBot Universal Prompt Guide v26 và hệ sinh thái đa ngôn ngữ 10 nước Đông Nam Á, nâng tầm sản phẩm thành một nền tảng giáo dục mang tầm vóc khu vực.</w:t>
+        <w:t>Đồng bộ hóa cẩm nang SimBot Universal Prompt Guide v27 và hệ sinh thái đa ngôn ngữ 10 nước Đông Nam Á, nâng tầm sản phẩm thành một nền tảng giáo dục mang tầm vóc khu vực.</w:t>
       </w:r>
     </w:p>
     <w:p>
@@ -5909,7 +5909,7 @@
           <w:rFonts w:ascii="Times New Roman" w:hAnsi="Times New Roman"/>
           <w:sz w:val="24"/>
         </w:rPr>
-        <w:t>[2] Lê Thanh Liêm (2026), SimBot Universal Prompt Guide v26: Cẩm nang toàn năng kiến tạo ứng dụng mô phỏng giáo dục và thí nghiệm ảo bằng Trí tuệ nhân tạo, Cần Thơ.</w:t>
+        <w:t>[2] Lê Thanh Liêm (2026), SimBot Universal Prompt Guide v27: Cẩm nang toàn năng kiến tạo ứng dụng mô phỏng giáo dục và thí nghiệm ảo bằng Trí tuệ nhân tạo, Cần Thơ.</w:t>
       </w:r>
     </w:p>
     <w:p>

</xml_diff>